<commit_message>
Update multiplayer rules and category selection
</commit_message>
<xml_diff>
--- a/docs/Cahier_des_charges_Wordstorm_Flutter.docx
+++ b/docs/Cahier_des_charges_Wordstorm_Flutter.docx
@@ -675,7 +675,7 @@
         <w:ind w:left="360"/>
       </w:pPr>
       <w:r>
-        <w:t>3. La manche prend fin à l’expiration du chronomètre commun ou, en mode sans chronomètre, lorsque le premier joueur ayant rempli toutes les catégories déclenche STOP. Une fin d’un commun accord peut aussi être proposée.</w:t>
+        <w:t>La manche prend fin à l’expiration du chronomètre commun ou, en mode sans chronomètre, lorsque le premier joueur ayant rempli toutes les catégories déclenche STOP. En multijoueur, si un joueur quitte l’application pendant la manche, ses réponses sont verrouillées et sa manche est considérée comme terminée ; les autres joueurs peuvent continuer. En mode sans chronomètre, un joueur sans activité pendant 20 minutes est expulsé du salon.</w:t>
       </w:r>
     </w:p>
     <w:p>
@@ -719,7 +719,7 @@
         <w:ind w:left="317" w:hanging="173"/>
       </w:pPr>
       <w:r>
-        <w:t>En mode sans chronomètre, STOP est déclenché par le premier joueur ayant rempli toutes les catégories. La fin par accord collectif peut être proposée. La disponibilité de STOP avec chronomètre reste à valider.</w:t>
+        <w:t>Avec chronomètre : durées proposées de 20 secondes en mode Speed, ou 30, 45, 60, 90 et 120 secondes. Sans chronomètre : le premier joueur ayant rempli toutes les catégories déclenche STOP et termine la manche pour tous. Un joueur qui quitte l’application en multijoueur voit ses réponses verrouillées et sa manche marquée comme terminée. Dans ce mode sans chronomètre, un joueur est expulsé du salon après 20 minutes sans activité.</w:t>
       </w:r>
     </w:p>
     <w:p>
@@ -980,7 +980,7 @@
     </w:p>
     <w:p>
       <w:r>
-        <w:t>L’écran de manche doit afficher la lettre, les catégories, les champs de réponse, le temps restant et, selon le mode, le bouton STOP. Le clavier ne doit pas masquer le champ actif.</w:t>
+        <w:t>L’écran de manche doit afficher la lettre, les catégories, les champs de réponse, le temps restant si le chronomètre est activé et, selon le mode, le bouton STOP. En mode multijoueur sans chronomètre, l’inactivité d’un joueur pendant 20 minutes entraîne son expulsion du salon. Si un joueur quitte l’application pendant une manche, ses réponses sont verrouillées et sa manche est terminée. Le clavier ne doit pas masquer le champ actif.</w:t>
       </w:r>
     </w:p>
     <w:p>
@@ -993,7 +993,7 @@
     </w:p>
     <w:p>
       <w:r>
-        <w:t>À la fin de la manche, les réponses doivent être verrouillées, validées et utilisées pour calculer les scores. Les résultats montrent les réponses des participants, les points attribués et les raisons de refus disponibles.</w:t>
+        <w:t>À la fin de la manche, les réponses doivent être verrouillées, validées et utilisées pour calculer les scores. En multijoueur, le départ d’un joueur de l’application verrouille ses réponses et termine sa manche sans interrompre celle des autres. Les résultats montrent les réponses des participants, les points attribués et les raisons de refus disponibles.</w:t>
       </w:r>
     </w:p>
     <w:p>
@@ -1006,7 +1006,7 @@
     </w:p>
     <w:p>
       <w:r>
-        <w:t>Un hôte crée une partie et obtient un code de six caractères. Les autres joueurs rejoignent ce code et saisissent un pseudo. Le salon affiche les participants et permet à l’hôte de démarrer. La capacité cible est de 2 à 8 joueurs.</w:t>
+        <w:t>Un hôte crée une partie et obtient un code de six caractères. Les autres joueurs rejoignent ce code et saisissent un pseudo. Le salon affiche les participants, le mode de sélection des catégories (aléatoire ou personnalisé) et permet à l’hôte de démarrer. Ce mode doit être clairement notifié à tous les joueurs dans le salon. En mode aléatoire, l’hôte ne peut pas choisir ni modifier les catégories. La capacité cible est de 2 à 8 joueurs.</w:t>
       </w:r>
     </w:p>
     <w:p>
@@ -1076,7 +1076,7 @@
         <w:ind w:left="317" w:hanging="173"/>
       </w:pPr>
       <w:r>
-        <w:t>Synchronisation : en conditions normales, l’arrêt d’une manche en ligne doit être propagé rapidement ; objectif indicatif inférieur à une seconde, à mesurer en test.</w:t>
+        <w:t>Synchronisation : en conditions normales, l’arrêt d’une manche en ligne et le verrouillage des réponses après le départ d’un joueur doivent être propagés rapidement ; objectif indicatif inférieur à une seconde, à mesurer en test. Le délai d’inactivité de 20 minutes en mode sans chronomètre est calculé de manière cohérente côté serveur.</w:t>
       </w:r>
     </w:p>
     <w:p>
@@ -1138,7 +1138,7 @@
         <w:ind w:left="317" w:hanging="173"/>
       </w:pPr>
       <w:r>
-        <w:t>Configuration de la partie et sélection des catégories.</w:t>
+        <w:t>Configuration de la partie et sélection du mode de catégories (aléatoire ou personnalisé), avec indication visible du mode choisi.</w:t>
       </w:r>
     </w:p>
     <w:p>
@@ -1174,7 +1174,7 @@
         <w:ind w:left="317" w:hanging="173"/>
       </w:pPr>
       <w:r>
-        <w:t>Écran de manche avec saisie et chronomètre.</w:t>
+        <w:t>Écran de manche avec saisie, chronomètre facultatif et indicateur d’état des joueurs en multijoueur.</w:t>
       </w:r>
     </w:p>
     <w:p>
@@ -1402,7 +1402,7 @@
         <w:ind w:left="317" w:hanging="173"/>
       </w:pPr>
       <w:r>
-        <w:t>Joueur : identifiant, pseudo, avatar facultatif, équipe facultative et état de présence.</w:t>
+        <w:t>Joueur : identifiant, pseudo, avatar facultatif, équipe facultative, état de présence et dernière activité en mode multijoueur sans chronomètre.</w:t>
       </w:r>
     </w:p>
     <w:p>
@@ -1411,7 +1411,7 @@
         <w:ind w:left="317" w:hanging="173"/>
       </w:pPr>
       <w:r>
-        <w:t>Manche : numéro, lettre, durée, état et horodatages.</w:t>
+        <w:t>Manche : numéro, lettre, durée ou absence de chronomètre, mode de catégories, catégories retenues, état et horodatages.</w:t>
       </w:r>
     </w:p>
     <w:p>
@@ -1592,7 +1592,7 @@
         <w:ind w:left="317" w:hanging="173"/>
       </w:pPr>
       <w:r>
-        <w:t>Le chronomètre termine la manche et verrouille les réponses.</w:t>
+        <w:t>Le chronomètre termine la manche et verrouille les réponses ; sans chronomètre, STOP du premier joueur ayant fini termine la manche pour tous.</w:t>
       </w:r>
     </w:p>
     <w:p>
@@ -1601,7 +1601,7 @@
         <w:ind w:left="317" w:hanging="173"/>
       </w:pPr>
       <w:r>
-        <w:t>En ligne, les participants reçoivent la même lettre et l’échéance commune.</w:t>
+        <w:t>En ligne, les participants reçoivent la même lettre, les mêmes catégories et le même mode de catégories. Le départ de l’application par un joueur verrouille ses réponses et termine sa manche sans arrêter celle des autres.</w:t>
       </w:r>
     </w:p>
     <w:p>
@@ -1633,7 +1633,7 @@
     </w:p>
     <w:p>
       <w:r>
-        <w:t>Les tests de performance, de latence et de compatibilité devront être réalisés sur les appareils réellement disponibles à l’équipe. Les critères seront affinés lorsque les modes et les règles encore ouvertes auront été validés.</w:t>
+        <w:t>Les tests de performance, de latence et de compatibilité devront être réalisés sur les appareils réellement disponibles à l’équipe. Vérifier aussi l’expulsion après 20 minutes d’inactivité en mode sans chronomètre et l’absence d’expulsion avant ce délai. Les critères seront affinés lorsque les modes et les règles encore ouvertes auront été validés.</w:t>
       </w:r>
     </w:p>
     <w:p>
@@ -2067,7 +2067,7 @@
         <w:spacing w:before="0" w:after="30" w:line="221" w:lineRule="auto"/>
       </w:pPr>
       <w:r>
-        <w:t>STOP : en mode sans chronomètre, le premier joueur ayant rempli toutes les catégories peut le déclencher. La fin par accord collectif peut aussi être proposée. La disponibilité de STOP avec chronomètre reste à décider.</w:t>
+        <w:t>STOP : en mode sans chronomètre, le premier joueur ayant rempli toutes les catégories peut le déclencher et termine la manche pour tous. En multijoueur, si un joueur quitte l’application pendant la manche, ses réponses sont verrouillées et sa manche est considérée comme terminée ; les autres joueurs poursuivent leur manche.</w:t>
       </w:r>
     </w:p>
     <w:p>
@@ -2117,7 +2117,7 @@
         <w:ind w:left="317" w:hanging="173"/>
       </w:pPr>
       <w:r>
-        <w:t>Connexion : l’hôte crée un salon et partage un code d’invitation. Les joueurs rejoignent la partie depuis leurs téléphones. Tous reçoivent la même lettre, les mêmes catégories et une échéance commune.</w:t>
+        <w:t>Connexion : l’hôte crée un salon et partage un code d’invitation. Les joueurs rejoignent la partie depuis leurs téléphones. Tous reçoivent la même lettre, les mêmes catégories et le même mode de sélection des catégories.</w:t>
       </w:r>
     </w:p>
     <w:p>
@@ -2127,7 +2127,7 @@
         <w:ind w:left="317" w:hanging="173"/>
       </w:pPr>
       <w:r>
-        <w:t>Déroulement : les réponses restent privées pendant la manche ; à la fin du chronomètre, elles sont verrouillées, puis validées et utilisées pour calculer les résultats. L’heure de fin doit être définie de manière cohérente côté serveur afin de limiter les désynchronisations.</w:t>
+        <w:t>Démarrage et fin de manche : les réponses restent privées pendant la manche ; à la fin, elles sont verrouillées, puis validées et utilisées pour calculer les résultats. En mode sans chronomètre, STOP déclenché par le premier joueur ayant rempli toutes les catégories termine la manche pour tous. Si un joueur quitte l’application pendant une manche multijoueur, ses réponses sont verrouillées et sa manche est marquée comme terminée, tandis que les autres continuent. L’heure de fin doit être définie de manière cohérente côté serveur afin de limiter les désynchronisations.</w:t>
       </w:r>
     </w:p>
     <w:p>
@@ -2155,7 +2155,7 @@
         <w:ind w:left="317" w:hanging="173"/>
       </w:pPr>
       <w:r>
-        <w:t>Choix par l’hôte : lors de la création d’une partie, l’hôte peut sélectionner manuellement les catégories proposées par le jeu et, si cette fonctionnalité est activée, définir des catégories personnalisées.</w:t>
+        <w:t>Mode personnalisé : l’hôte choisit les catégories proposées par le jeu et peut, si cette fonction est activée, ajouter des catégories personnalisées. Le mode « Personnalisé » est indiqué à tous les joueurs dans le salon avant le lancement.</w:t>
       </w:r>
     </w:p>
     <w:p>
@@ -2165,7 +2165,7 @@
         <w:ind w:left="317" w:hanging="173"/>
       </w:pPr>
       <w:r>
-        <w:t>Sélection aléatoire : l’hôte peut également demander au système de choisir automatiquement les catégories complémentaires pour la manche ou la partie.</w:t>
+        <w:t>Mode aléatoire : le système choisit automatiquement les catégories parmi la liste disponible. En mode aléatoire, l’hôte ne peut ni choisir, ni retirer, ni modifier les catégories tirées.</w:t>
       </w:r>
     </w:p>
     <w:p>
@@ -2175,7 +2175,7 @@
         <w:ind w:left="317" w:hanging="173"/>
       </w:pPr>
       <w:r>
-        <w:t>Catégories persistantes : quel que soit le mode de sélection, un socle de catégories incontournables reste toujours présent afin de préserver l’esprit du Petit Bac. La sélection aléatoire ne concerne donc que les catégories complémentaires.</w:t>
+        <w:t>Catégories communes : les règles du jeu peuvent imposer un socle de catégories persistantes, qui reste présent dans les deux modes. En mode aléatoire, le système choisit les catégories complémentaires sans doublons ; en mode personnalisé, l’hôte configure la sélection autorisée.</w:t>
       </w:r>
     </w:p>
     <w:p>
@@ -2185,7 +2185,7 @@
         <w:ind w:left="317" w:hanging="173"/>
       </w:pPr>
       <w:r>
-        <w:t>Liste de référence : les catégories persistantes et les catégories complémentaires disponibles doivent être identifiées dans une liste centrale, administrable et réutilisée en solo comme en multijoueur. La liste exacte des catégories persistantes reste à valider avec l’équipe.</w:t>
+        <w:t>Notification du mode : le salon affiche clairement « Aléatoire » ou « Personnalisé » à tous les participants dès que l’hôte a configuré la partie et jusqu’au début de la manche. Le mode choisi et la liste finale des catégories sont enregistrés dans les données de la partie.</w:t>
       </w:r>
     </w:p>
     <w:p>
@@ -2195,7 +2195,7 @@
         <w:ind w:left="317" w:hanging="173"/>
       </w:pPr>
       <w:r>
-        <w:t>Cohérence en ligne : une fois la partie lancée, la liste finale des catégories est fixée et identique pour tous les participants. L’hôte ne peut pas la modifier en cours de manche.</w:t>
+        <w:t>Cohérence en ligne : le mode de catégories et la liste finale sont identiques et visibles pour tous les participants. Après le lancement, l’hôte ne peut pas modifier la sélection en cours de manche.</w:t>
       </w:r>
     </w:p>
     <w:p>
@@ -2205,7 +2205,7 @@
         <w:ind w:left="317" w:hanging="173"/>
       </w:pPr>
       <w:r>
-        <w:t>Règle de tirage : en mode aléatoire, le système conserve toutes les catégories persistantes, puis tire le nombre prévu de catégories complémentaires parmi celles qui sont disponibles, sans doublons.</w:t>
+        <w:t>Règle de tirage : en mode aléatoire, le système conserve les catégories communes obligatoires, puis tire le nombre prévu de catégories complémentaires disponibles, sans doublons et sans intervention de l’hôte.</w:t>
       </w:r>
     </w:p>
     <w:p>

</xml_diff>

<commit_message>
Clarify player departure and individual scoring
</commit_message>
<xml_diff>
--- a/docs/Cahier_des_charges_Wordstorm_Flutter.docx
+++ b/docs/Cahier_des_charges_Wordstorm_Flutter.docx
@@ -675,7 +675,7 @@
         <w:ind w:left="360"/>
       </w:pPr>
       <w:r>
-        <w:t>La manche prend fin à l’expiration du chronomètre commun ou, en mode sans chronomètre, lorsque le premier joueur ayant rempli toutes les catégories déclenche STOP. En multijoueur, si un joueur quitte l’application pendant la manche, ses réponses sont verrouillées et sa manche est considérée comme terminée ; les autres joueurs peuvent continuer. En mode sans chronomètre, un joueur sans activité pendant 20 minutes est expulsé du salon.</w:t>
+        <w:t>La manche prend fin à l’expiration du chronomètre commun ou, en mode sans chronomètre, lorsque le premier joueur ayant rempli toutes les catégories déclenche STOP. En multijoueur, si un joueur quitte l’application, sa participation à la manche et à la partie prend fin pour lui seul : ses réponses déjà saisies sont conservées et verrouillées. À la fin, ses points sont calculés à partir de ces réponses et ajoutés à son total. Les autres joueurs poursuivent la manche et la partie normalement. En mode sans chronomètre, un joueur sans activité pendant 20 minutes est expulsé du salon.</w:t>
       </w:r>
     </w:p>
     <w:p>
@@ -719,7 +719,7 @@
         <w:ind w:left="317" w:hanging="173"/>
       </w:pPr>
       <w:r>
-        <w:t>Avec chronomètre : durées proposées de 20 secondes en mode Speed, ou 30, 45, 60, 90 et 120 secondes. Sans chronomètre : le premier joueur ayant rempli toutes les catégories déclenche STOP et termine la manche pour tous. Un joueur qui quitte l’application en multijoueur voit ses réponses verrouillées et sa manche marquée comme terminée. Dans ce mode sans chronomètre, un joueur est expulsé du salon après 20 minutes sans activité.</w:t>
+        <w:t>Avec chronomètre : durées proposées de 20 secondes en mode Speed, ou 30, 45, 60, 90 et 120 secondes. Sans chronomètre : le premier joueur ayant rempli toutes les catégories déclenche STOP et termine la manche pour tous. Si un joueur quitte l’application en multijoueur, sa manche et sa partie se terminent pour lui seul ; ses réponses déjà saisies sont verrouillées, conservées et comptabilisées à la fin à partir des réponses qu’il a fournies. Les autres joueurs continuent normalement. En mode sans chronomètre, un joueur est expulsé du salon après 20 minutes sans activité.</w:t>
       </w:r>
     </w:p>
     <w:p>
@@ -980,7 +980,7 @@
     </w:p>
     <w:p>
       <w:r>
-        <w:t>L’écran de manche doit afficher la lettre, les catégories, les champs de réponse, le temps restant si le chronomètre est activé et, selon le mode, le bouton STOP. En mode multijoueur sans chronomètre, l’inactivité d’un joueur pendant 20 minutes entraîne son expulsion du salon. Si un joueur quitte l’application pendant une manche, ses réponses sont verrouillées et sa manche est terminée. Le clavier ne doit pas masquer le champ actif.</w:t>
+        <w:t>L’écran de manche doit afficher la lettre, les catégories, les champs de réponse, le temps restant si le chronomètre est activé et, selon le mode, le bouton STOP. En mode multijoueur sans chronomètre, l’inactivité d’un joueur pendant 20 minutes entraîne son expulsion du salon. Si un joueur quitte l’application, sa participation à la manche et à la partie prend fin pour lui seul : ses réponses déjà saisies sont verrouillées et conservées pour le calcul de son score ; les autres continuent. Le clavier ne doit pas masquer le champ actif.</w:t>
       </w:r>
     </w:p>
     <w:p>
@@ -993,7 +993,7 @@
     </w:p>
     <w:p>
       <w:r>
-        <w:t>À la fin de la manche, les réponses doivent être verrouillées, validées et utilisées pour calculer les scores. En multijoueur, le départ d’un joueur de l’application verrouille ses réponses et termine sa manche sans interrompre celle des autres. Les résultats montrent les réponses des participants, les points attribués et les raisons de refus disponibles.</w:t>
+        <w:t>À la fin de la manche, les réponses doivent être verrouillées, validées et utilisées pour calculer les scores. En multijoueur, si un joueur quitte l’application, sa partie se termine pour lui seul ; ses réponses déjà saisies restent conservées et ses points sont calculés à la fin à partir de ces réponses. Le départ d’un joueur ne met fin ni à la manche ni à la partie des autres participants. Les résultats montrent les réponses, les points attribués et les raisons de refus disponibles.</w:t>
       </w:r>
     </w:p>
     <w:p>
@@ -1076,7 +1076,7 @@
         <w:ind w:left="317" w:hanging="173"/>
       </w:pPr>
       <w:r>
-        <w:t>Synchronisation : en conditions normales, l’arrêt d’une manche en ligne et le verrouillage des réponses après le départ d’un joueur doivent être propagés rapidement ; objectif indicatif inférieur à une seconde, à mesurer en test. Le délai d’inactivité de 20 minutes en mode sans chronomètre est calculé de manière cohérente côté serveur.</w:t>
+        <w:t>Synchronisation : en conditions normales, l’arrêt d’une manche en ligne et le verrouillage des seules réponses du joueur qui quitte l’application doivent être propagés rapidement ; objectif indicatif inférieur à une seconde, à mesurer en test. La fin de participation et le calcul du score de ce joueur ne doivent pas modifier l’état de la partie des autres. Le délai d’inactivité de 20 minutes en mode sans chronomètre est calculé de manière cohérente côté serveur.</w:t>
       </w:r>
     </w:p>
     <w:p>
@@ -1402,7 +1402,7 @@
         <w:ind w:left="317" w:hanging="173"/>
       </w:pPr>
       <w:r>
-        <w:t>Joueur : identifiant, pseudo, avatar facultatif, équipe facultative, état de présence et dernière activité en mode multijoueur sans chronomètre.</w:t>
+        <w:t>Joueur : identifiant, pseudo, avatar facultatif, équipe facultative, état de présence, état de participation (en cours ou terminée), réponses conservées et dernière activité en mode multijoueur sans chronomètre.</w:t>
       </w:r>
     </w:p>
     <w:p>
@@ -1601,7 +1601,7 @@
         <w:ind w:left="317" w:hanging="173"/>
       </w:pPr>
       <w:r>
-        <w:t>En ligne, les participants reçoivent la même lettre, les mêmes catégories et le même mode de catégories. Le départ de l’application par un joueur verrouille ses réponses et termine sa manche sans arrêter celle des autres.</w:t>
+        <w:t>En ligne, les participants reçoivent la même lettre, les mêmes catégories et le même mode de catégories. Vérifier que quitter l’application termine la participation du joueur concerné seulement, conserve ses réponses et comptabilise ses points à partir de celles-ci, sans arrêter la manche ni la partie des autres.</w:t>
       </w:r>
     </w:p>
     <w:p>
@@ -2067,7 +2067,7 @@
         <w:spacing w:before="0" w:after="30" w:line="221" w:lineRule="auto"/>
       </w:pPr>
       <w:r>
-        <w:t>STOP : en mode sans chronomètre, le premier joueur ayant rempli toutes les catégories peut le déclencher et termine la manche pour tous. En multijoueur, si un joueur quitte l’application pendant la manche, ses réponses sont verrouillées et sa manche est considérée comme terminée ; les autres joueurs poursuivent leur manche.</w:t>
+        <w:t>STOP : en mode sans chronomètre, le premier joueur ayant rempli toutes les catégories peut le déclencher et termine la manche pour tous. Si un joueur quitte l’application pendant une partie multijoueur, sa participation à la manche et à la partie se termine pour lui seul ; ses réponses déjà saisies sont conservées, verrouillées et comptabilisées à la fin. Les autres joueurs poursuivent leur manche et la partie normalement.</w:t>
       </w:r>
     </w:p>
     <w:p>
@@ -2127,7 +2127,7 @@
         <w:ind w:left="317" w:hanging="173"/>
       </w:pPr>
       <w:r>
-        <w:t>Démarrage et fin de manche : les réponses restent privées pendant la manche ; à la fin, elles sont verrouillées, puis validées et utilisées pour calculer les résultats. En mode sans chronomètre, STOP déclenché par le premier joueur ayant rempli toutes les catégories termine la manche pour tous. Si un joueur quitte l’application pendant une manche multijoueur, ses réponses sont verrouillées et sa manche est marquée comme terminée, tandis que les autres continuent. L’heure de fin doit être définie de manière cohérente côté serveur afin de limiter les désynchronisations.</w:t>
+        <w:t>Démarrage et fin de manche : les réponses restent privées pendant la manche ; à la fin, elles sont verrouillées, puis validées et utilisées pour calculer les résultats. En mode sans chronomètre, STOP déclenché par le premier joueur ayant rempli toutes les catégories termine la manche pour tous. Si un joueur quitte l’application pendant une partie multijoueur, sa manche et sa partie se terminent pour lui seul. Ses réponses déjà saisies sont conservées et verrouillées ; à la fin, ses points sont calculés à partir de ces réponses. Les autres joueurs continuent normalement et la partie commune ne s’arrête que selon ses règles habituelles. L’heure de fin doit être définie de manière cohérente côté serveur afin de limiter les désynchronisations.</w:t>
       </w:r>
     </w:p>
     <w:p>
@@ -2233,7 +2233,7 @@
         <w:ind w:left="317" w:hanging="173"/>
       </w:pPr>
       <w:r>
-        <w:t>Manche : lettre commune, heure de début, heure de fin, durée et état (en attente, en cours, terminée).</w:t>
+        <w:t>Manche : numéro, lettre, durée, mode de catégories, catégories retenues, état et horodatages. Le départ d’un joueur met fin uniquement à sa participation individuelle ; les réponses déjà saisies restent rattachées à son joueur pour le calcul final de ses points.</w:t>
       </w:r>
     </w:p>
     <w:p>

</xml_diff>